<commit_message>
Added Programming all files
</commit_message>
<xml_diff>
--- a/Information Security/2. Note-- PMSCS-694-Lecture-2-Attacks.docx
+++ b/Information Security/2. Note-- PMSCS-694-Lecture-2-Attacks.docx
@@ -126,6 +126,60 @@
     <w:p>
       <w:pPr>
         <w:rPr>
+          <w:rStyle w:val="Strong"/>
+          <w:rFonts w:ascii="Segoe UI" w:hAnsi="Segoe UI" w:cs="Segoe UI"/>
+          <w:shd w:val="clear" w:color="auto" w:fill="FFFFFF"/>
+        </w:rPr>
+      </w:pPr>
+      <w:r>
+        <w:rPr>
+          <w:rStyle w:val="Strong"/>
+          <w:rFonts w:ascii="Segoe UI" w:hAnsi="Segoe UI" w:cs="Segoe UI"/>
+          <w:color w:val="FF0000"/>
+          <w:u w:val="single"/>
+          <w:shd w:val="clear" w:color="auto" w:fill="FFFFFF"/>
+        </w:rPr>
+        <w:t>CIA Triad:</w:t>
+      </w:r>
+      <w:r>
+        <w:rPr>
+          <w:rStyle w:val="Strong"/>
+          <w:rFonts w:ascii="Segoe UI" w:hAnsi="Segoe UI" w:cs="Segoe UI"/>
+          <w:color w:val="FF0000"/>
+          <w:shd w:val="clear" w:color="auto" w:fill="FFFFFF"/>
+        </w:rPr>
+        <w:t xml:space="preserve"> </w:t>
+      </w:r>
+      <w:r>
+        <w:rPr>
+          <w:rStyle w:val="Strong"/>
+          <w:rFonts w:ascii="Segoe UI" w:hAnsi="Segoe UI" w:cs="Segoe UI"/>
+          <w:shd w:val="clear" w:color="auto" w:fill="FFFFFF"/>
+        </w:rPr>
+        <w:t xml:space="preserve">First 3 </w:t>
+      </w:r>
+      <w:proofErr w:type="spellStart"/>
+      <w:r>
+        <w:rPr>
+          <w:rStyle w:val="Strong"/>
+          <w:rFonts w:ascii="Segoe UI" w:hAnsi="Segoe UI" w:cs="Segoe UI"/>
+          <w:shd w:val="clear" w:color="auto" w:fill="FFFFFF"/>
+        </w:rPr>
+        <w:t>tak</w:t>
+      </w:r>
+      <w:proofErr w:type="spellEnd"/>
+      <w:r>
+        <w:rPr>
+          <w:rStyle w:val="Strong"/>
+          <w:rFonts w:ascii="Segoe UI" w:hAnsi="Segoe UI" w:cs="Segoe UI"/>
+          <w:shd w:val="clear" w:color="auto" w:fill="FFFFFF"/>
+        </w:rPr>
+        <w:t xml:space="preserve"> CIA Triad bola hoi</w:t>
+      </w:r>
+    </w:p>
+    <w:p>
+      <w:pPr>
+        <w:rPr>
           <w:b/>
           <w:color w:val="FF0000"/>
           <w:sz w:val="28"/>
@@ -134,48 +188,19 @@
       </w:pPr>
       <w:r>
         <w:rPr>
-          <w:rStyle w:val="Strong"/>
-          <w:rFonts w:ascii="Segoe UI" w:hAnsi="Segoe UI" w:cs="Segoe UI"/>
-          <w:color w:val="FF0000"/>
-          <w:u w:val="single"/>
-          <w:shd w:val="clear" w:color="auto" w:fill="FFFFFF"/>
-        </w:rPr>
-        <w:t>CIA Triad:</w:t>
-      </w:r>
-      <w:r>
-        <w:rPr>
-          <w:rStyle w:val="Strong"/>
-          <w:rFonts w:ascii="Segoe UI" w:hAnsi="Segoe UI" w:cs="Segoe UI"/>
-          <w:color w:val="FF0000"/>
-          <w:shd w:val="clear" w:color="auto" w:fill="FFFFFF"/>
-        </w:rPr>
-        <w:t xml:space="preserve"> </w:t>
-      </w:r>
-      <w:r>
-        <w:rPr>
-          <w:rStyle w:val="Strong"/>
-          <w:rFonts w:ascii="Segoe UI" w:hAnsi="Segoe UI" w:cs="Segoe UI"/>
-          <w:shd w:val="clear" w:color="auto" w:fill="FFFFFF"/>
-        </w:rPr>
-        <w:t xml:space="preserve">First 3 </w:t>
-      </w:r>
-      <w:proofErr w:type="spellStart"/>
-      <w:r>
-        <w:rPr>
-          <w:rStyle w:val="Strong"/>
-          <w:rFonts w:ascii="Segoe UI" w:hAnsi="Segoe UI" w:cs="Segoe UI"/>
-          <w:shd w:val="clear" w:color="auto" w:fill="FFFFFF"/>
-        </w:rPr>
-        <w:t>tak</w:t>
-      </w:r>
-      <w:proofErr w:type="spellEnd"/>
-      <w:r>
-        <w:rPr>
-          <w:rStyle w:val="Strong"/>
-          <w:rFonts w:ascii="Segoe UI" w:hAnsi="Segoe UI" w:cs="Segoe UI"/>
-          <w:shd w:val="clear" w:color="auto" w:fill="FFFFFF"/>
-        </w:rPr>
-        <w:t xml:space="preserve"> CIA Triad bola hoi</w:t>
+          <w:rFonts w:ascii="Segoe UI" w:hAnsi="Segoe UI" w:cs="Segoe UI"/>
+          <w:color w:val="0D0D0D"/>
+          <w:shd w:val="clear" w:color="auto" w:fill="FFFFFF"/>
+        </w:rPr>
+        <w:t>The CIA triad consists of Confidentiality, Integrity, and Availability, which are the core objectives of information security.</w:t>
+      </w:r>
+      <w:r>
+        <w:rPr>
+          <w:rFonts w:ascii="Segoe UI" w:hAnsi="Segoe UI" w:cs="Segoe UI"/>
+          <w:color w:val="0D0D0D"/>
+          <w:shd w:val="clear" w:color="auto" w:fill="FFFFFF"/>
+        </w:rPr>
+        <w:t xml:space="preserve"> </w:t>
       </w:r>
     </w:p>
     <w:p>
@@ -965,6 +990,59 @@
     <w:p>
       <w:pPr>
         <w:rPr>
+          <w:rStyle w:val="Strong"/>
+          <w:rFonts w:ascii="Segoe UI" w:hAnsi="Segoe UI" w:cs="Segoe UI"/>
+          <w:b w:val="0"/>
+          <w:color w:val="0D0D0D"/>
+          <w:shd w:val="clear" w:color="auto" w:fill="FFFFFF"/>
+        </w:rPr>
+      </w:pPr>
+      <w:r>
+        <w:rPr>
+          <w:rStyle w:val="Strong"/>
+          <w:rFonts w:ascii="Segoe UI" w:hAnsi="Segoe UI" w:cs="Segoe UI"/>
+          <w:color w:val="0D0D0D"/>
+          <w:u w:val="single"/>
+          <w:shd w:val="clear" w:color="auto" w:fill="FFFFFF"/>
+        </w:rPr>
+        <w:t>Example:</w:t>
+      </w:r>
+      <w:r>
+        <w:rPr>
+          <w:rStyle w:val="Strong"/>
+          <w:rFonts w:ascii="Segoe UI" w:hAnsi="Segoe UI" w:cs="Segoe UI"/>
+          <w:b w:val="0"/>
+          <w:color w:val="0D0D0D"/>
+          <w:shd w:val="clear" w:color="auto" w:fill="FFFFFF"/>
+        </w:rPr>
+        <w:t xml:space="preserve"> When see the SSC/HSC online result sheet. This is the concept lack of </w:t>
+      </w:r>
+      <w:proofErr w:type="spellStart"/>
+      <w:r>
+        <w:rPr>
+          <w:rStyle w:val="Strong"/>
+          <w:rFonts w:ascii="Segoe UI" w:hAnsi="Segoe UI" w:cs="Segoe UI"/>
+          <w:b w:val="0"/>
+          <w:color w:val="0D0D0D"/>
+          <w:shd w:val="clear" w:color="auto" w:fill="FFFFFF"/>
+        </w:rPr>
+        <w:t>Avalability</w:t>
+      </w:r>
+      <w:proofErr w:type="spellEnd"/>
+      <w:r>
+        <w:rPr>
+          <w:rStyle w:val="Strong"/>
+          <w:rFonts w:ascii="Segoe UI" w:hAnsi="Segoe UI" w:cs="Segoe UI"/>
+          <w:b w:val="0"/>
+          <w:color w:val="0D0D0D"/>
+          <w:shd w:val="clear" w:color="auto" w:fill="FFFFFF"/>
+        </w:rPr>
+        <w:t>.</w:t>
+      </w:r>
+    </w:p>
+    <w:p>
+      <w:pPr>
+        <w:rPr>
           <w:b/>
           <w:sz w:val="28"/>
           <w:szCs w:val="28"/>
@@ -979,6 +1057,7 @@
           <w:u w:val="single"/>
           <w:shd w:val="clear" w:color="auto" w:fill="FFFFFF"/>
         </w:rPr>
+        <w:lastRenderedPageBreak/>
         <w:t>How Does the CIA Triad Relate to Security?</w:t>
       </w:r>
     </w:p>
@@ -998,7 +1077,6 @@
           <w:szCs w:val="28"/>
           <w:u w:val="single"/>
         </w:rPr>
-        <w:lastRenderedPageBreak/>
         <w:t xml:space="preserve">Answer:  </w:t>
       </w:r>
       <w:r>
@@ -3086,6 +3164,7 @@
           <w:sz w:val="24"/>
           <w:szCs w:val="24"/>
         </w:rPr>
+        <w:lastRenderedPageBreak/>
         <w:t>মূলত</w:t>
       </w:r>
       <w:proofErr w:type="spellEnd"/>
@@ -3298,7 +3377,6 @@
           <w:sz w:val="24"/>
           <w:szCs w:val="24"/>
         </w:rPr>
-        <w:lastRenderedPageBreak/>
         <w:t>ধারণার</w:t>
       </w:r>
       <w:proofErr w:type="spellEnd"/>
@@ -4110,8 +4188,6 @@
     <w:p>
       <w:pPr>
         <w:pStyle w:val="NormalWeb"/>
-      </w:pPr>
-      <w:r>
         <w:rPr>
           <w:b/>
           <w:color w:val="FF0000"/>
@@ -4119,8 +4195,74 @@
           <w:szCs w:val="40"/>
           <w:u w:val="single"/>
         </w:rPr>
+      </w:pPr>
+      <w:r>
+        <w:rPr>
+          <w:b/>
+          <w:color w:val="FF0000"/>
+          <w:sz w:val="40"/>
+          <w:szCs w:val="40"/>
+          <w:u w:val="single"/>
+        </w:rPr>
         <w:t>Attacks:</w:t>
       </w:r>
+    </w:p>
+    <w:p>
+      <w:pPr>
+        <w:pStyle w:val="NormalWeb"/>
+      </w:pPr>
+      <w:r>
+        <w:rPr>
+          <w:rFonts w:ascii="Segoe UI Symbol" w:hAnsi="Segoe UI Symbol" w:cs="Segoe UI Symbol"/>
+          <w:color w:val="0D0D0D"/>
+          <w:shd w:val="clear" w:color="auto" w:fill="FFFFFF"/>
+        </w:rPr>
+        <w:t>👉</w:t>
+      </w:r>
+      <w:r>
+        <w:rPr>
+          <w:rFonts w:ascii="Segoe UI" w:hAnsi="Segoe UI" w:cs="Segoe UI"/>
+          <w:color w:val="0D0D0D"/>
+          <w:shd w:val="clear" w:color="auto" w:fill="FFFFFF"/>
+        </w:rPr>
+        <w:t xml:space="preserve"> An </w:t>
+      </w:r>
+      <w:r>
+        <w:rPr>
+          <w:rStyle w:val="Strong"/>
+          <w:rFonts w:ascii="Segoe UI" w:hAnsi="Segoe UI" w:cs="Segoe UI"/>
+          <w:color w:val="0D0D0D"/>
+          <w:shd w:val="clear" w:color="auto" w:fill="FFFFFF"/>
+        </w:rPr>
+        <w:t>attack</w:t>
+      </w:r>
+      <w:r>
+        <w:rPr>
+          <w:rFonts w:ascii="Segoe UI" w:hAnsi="Segoe UI" w:cs="Segoe UI"/>
+          <w:color w:val="0D0D0D"/>
+          <w:shd w:val="clear" w:color="auto" w:fill="FFFFFF"/>
+        </w:rPr>
+        <w:t> is any attempt to </w:t>
+      </w:r>
+      <w:r>
+        <w:rPr>
+          <w:rStyle w:val="Strong"/>
+          <w:rFonts w:ascii="Segoe UI" w:hAnsi="Segoe UI" w:cs="Segoe UI"/>
+          <w:color w:val="0D0D0D"/>
+          <w:shd w:val="clear" w:color="auto" w:fill="FFFFFF"/>
+        </w:rPr>
+        <w:t>harm, disrupt, or gain unauthorized access</w:t>
+      </w:r>
+      <w:r>
+        <w:rPr>
+          <w:rFonts w:ascii="Segoe UI" w:hAnsi="Segoe UI" w:cs="Segoe UI"/>
+          <w:color w:val="0D0D0D"/>
+          <w:shd w:val="clear" w:color="auto" w:fill="FFFFFF"/>
+        </w:rPr>
+        <w:t> to a system, network, or data.</w:t>
+      </w:r>
+      <w:bookmarkStart w:id="0" w:name="_GoBack"/>
+      <w:bookmarkEnd w:id="0"/>
       <w:r>
         <w:rPr>
           <w:b/>
@@ -4296,6 +4438,7 @@
           <w:sz w:val="27"/>
           <w:szCs w:val="27"/>
         </w:rPr>
+        <w:lastRenderedPageBreak/>
         <w:t>বাংলা</w:t>
       </w:r>
       <w:proofErr w:type="spellEnd"/>
@@ -4670,7 +4813,6 @@
           <w:sz w:val="24"/>
           <w:szCs w:val="24"/>
         </w:rPr>
-        <w:lastRenderedPageBreak/>
         <w:t>এই</w:t>
       </w:r>
       <w:proofErr w:type="spellEnd"/>
@@ -7355,6 +7497,7 @@
           <w:sz w:val="24"/>
           <w:szCs w:val="24"/>
         </w:rPr>
+        <w:lastRenderedPageBreak/>
         <w:t>-&gt;</w:t>
       </w:r>
       <w:proofErr w:type="spellStart"/>
@@ -7432,7 +7575,6 @@
           <w:szCs w:val="24"/>
           <w:u w:val="single"/>
         </w:rPr>
-        <w:lastRenderedPageBreak/>
         <w:t>DoS</w:t>
       </w:r>
       <w:proofErr w:type="spellEnd"/>
@@ -10748,6 +10890,7 @@
           <w:sz w:val="24"/>
           <w:szCs w:val="24"/>
         </w:rPr>
+        <w:lastRenderedPageBreak/>
         <w:t>মিথ্যা</w:t>
       </w:r>
       <w:proofErr w:type="spellEnd"/>
@@ -10904,7 +11047,6 @@
           <w:sz w:val="24"/>
           <w:szCs w:val="24"/>
         </w:rPr>
-        <w:lastRenderedPageBreak/>
         <w:t>Fabrication</w:t>
       </w:r>
       <w:r>
@@ -11916,7 +12058,6 @@
           <w:sz w:val="30"/>
           <w:szCs w:val="30"/>
         </w:rPr>
-        <w:lastRenderedPageBreak/>
         <w:t>3</w:t>
       </w:r>
       <w:r>
@@ -12544,6 +12685,7 @@
           <w:szCs w:val="30"/>
           <w:u w:val="single"/>
         </w:rPr>
+        <w:lastRenderedPageBreak/>
         <w:t>Steps of Risk Management (Exam Friendly)</w:t>
       </w:r>
     </w:p>
@@ -12591,7 +12733,6 @@
           <w:sz w:val="24"/>
           <w:szCs w:val="24"/>
         </w:rPr>
-        <w:lastRenderedPageBreak/>
         <w:t>👉</w:t>
       </w:r>
       <w:r>
@@ -13041,15 +13182,7 @@
           <w:rFonts w:ascii="Segoe UI" w:hAnsi="Segoe UI" w:cs="Segoe UI"/>
           <w:color w:val="0D0D0D"/>
         </w:rPr>
-        <w:t>-&gt;</w:t>
-      </w:r>
-      <w:r>
-        <w:rPr>
-          <w:rStyle w:val="Strong"/>
-          <w:rFonts w:ascii="Segoe UI" w:hAnsi="Segoe UI" w:cs="Segoe UI"/>
-          <w:color w:val="0D0D0D"/>
-        </w:rPr>
-        <w:t>Confidentiality:</w:t>
+        <w:t>-&gt;Confidentiality:</w:t>
       </w:r>
       <w:r>
         <w:rPr>
@@ -13090,15 +13223,7 @@
           <w:rFonts w:ascii="Segoe UI" w:hAnsi="Segoe UI" w:cs="Segoe UI"/>
           <w:color w:val="0D0D0D"/>
         </w:rPr>
-        <w:t>-&gt;</w:t>
-      </w:r>
-      <w:r>
-        <w:rPr>
-          <w:rStyle w:val="Strong"/>
-          <w:rFonts w:ascii="Segoe UI" w:hAnsi="Segoe UI" w:cs="Segoe UI"/>
-          <w:color w:val="0D0D0D"/>
-        </w:rPr>
-        <w:t>Integrity:</w:t>
+        <w:t>-&gt;Integrity:</w:t>
       </w:r>
       <w:r>
         <w:rPr>
@@ -13139,15 +13264,7 @@
           <w:rFonts w:ascii="Segoe UI" w:hAnsi="Segoe UI" w:cs="Segoe UI"/>
           <w:color w:val="0D0D0D"/>
         </w:rPr>
-        <w:t>-&gt;</w:t>
-      </w:r>
-      <w:r>
-        <w:rPr>
-          <w:rStyle w:val="Strong"/>
-          <w:rFonts w:ascii="Segoe UI" w:hAnsi="Segoe UI" w:cs="Segoe UI"/>
-          <w:color w:val="0D0D0D"/>
-        </w:rPr>
-        <w:t>Availability:</w:t>
+        <w:t>-&gt;Availability:</w:t>
       </w:r>
       <w:r>
         <w:rPr>
@@ -13458,15 +13575,7 @@
           <w:color w:val="0D0D0D"/>
           <w:shd w:val="clear" w:color="auto" w:fill="FFFFFF"/>
         </w:rPr>
-        <w:t xml:space="preserve">Availability: </w:t>
-      </w:r>
-      <w:r>
-        <w:rPr>
-          <w:rFonts w:ascii="Segoe UI" w:hAnsi="Segoe UI" w:cs="Segoe UI"/>
-          <w:color w:val="0D0D0D"/>
-          <w:shd w:val="clear" w:color="auto" w:fill="FFFFFF"/>
-        </w:rPr>
-        <w:t>If the system goes down, payments cannot be processed.</w:t>
+        <w:t>Availability: If the system goes down, payments cannot be processed.</w:t>
       </w:r>
       <w:r>
         <w:rPr>
@@ -13631,6 +13740,7 @@
           <w:sz w:val="24"/>
           <w:szCs w:val="24"/>
         </w:rPr>
+        <w:lastRenderedPageBreak/>
         <w:t>Physical Controls:</w:t>
       </w:r>
       <w:r>
@@ -13716,8 +13826,6 @@
         </w:rPr>
         <w:t> Policies, rules, password policies</w:t>
       </w:r>
-      <w:bookmarkStart w:id="0" w:name="_GoBack"/>
-      <w:bookmarkEnd w:id="0"/>
     </w:p>
     <w:sectPr>
       <w:pgSz w:w="12240" w:h="15840"/>

</xml_diff>